<commit_message>
Dokumentacja: nazwa AdminReminder i odswiezone zrzuty ekranu
Oba dokumenty zostaly przy starej nazwie — sed przy zmianie nazwy szedl po
plikach tekstowych, a .docx to zip z XML-em, wiec go nie dotknal.

- tekst: 3 wystapienia "Admin Redminer" (1 w Technicznej, 2 w Powdrozeniowej)
- Powdrozeniowa niosla w sobie komplet 15 STARYCH zrzutow ekranu ze starym
  logo — te same pliki, ktore podmienilismy w screenshots/; dopasowanie po
  wymiarach i rozmiarze w bajtach bylo 1:1, wiec kazdy zostal zastapiony
  swoim odpowiednikiem

Cztery zrzuty (pelnostronicowe zakladki ustawien) maja teraz inna wysokosc niz
poprzednio, wiec wp:extent zostal przeliczony proporcjonalnie — bez tego
wyswietlalyby sie rozciagniete o kilka procent.

Zmieniona wylacznie warstwa nazwy i obrazow, tresc merytoryczna nietknieta:
dlugosc tekstu 15833 -> 15831 znakow, czyli dokladnie -2 za dwa skrocone
wystapienia nazwy. XML wszystkich czesci parsuje sie poprawnie.
</commit_message>
<xml_diff>
--- a/docs/AR_Dokumentacja_Powdrozeniowa.docx
+++ b/docs/AR_Dokumentacja_Powdrozeniowa.docx
@@ -28,7 +28,7 @@
           <w:color w:val="606060"/>
           <w:sz w:val="32"/>
         </w:rPr>
-        <w:t>Admin Redminer</w:t>
+        <w:t>AdminReminder</w:t>
       </w:r>
     </w:p>
     <w:p/>
@@ -382,7 +382,7 @@
     </w:p>
     <w:p>
       <w:r>
-        <w:t>Admin Redminer (AR) to narzędzie „od admina dla admina” do śledzenia terminów ważności i odnowień. Zastępuje listę w Excelu/SharePoincie czymś, co samo pobiera daty i ostrzega zawczasu. AR monitoruje dwie klasy obiektów:</w:t>
+        <w:t>AdminReminder (AR) to narzędzie „od admina dla admina” do śledzenia terminów ważności i odnowień. Zastępuje listę w Excelu/SharePoincie czymś, co samo pobiera daty i ostrzega zawczasu. AR monitoruje dwie klasy obiektów:</w:t>
       </w:r>
     </w:p>
     <w:p>
@@ -3182,7 +3182,7 @@
       <w:r>
         <w:drawing>
           <wp:inline xmlns:a="http://schemas.openxmlformats.org/drawingml/2006/main" xmlns:pic="http://schemas.openxmlformats.org/drawingml/2006/picture">
-            <wp:extent cx="5580000" cy="2695498"/>
+            <wp:extent cx="5580000" cy="2644688"/>
             <wp:docPr id="10" name="Picture 10"/>
             <wp:cNvGraphicFramePr>
               <a:graphicFrameLocks noChangeAspect="1"/>
@@ -3278,7 +3278,7 @@
       <w:r>
         <w:drawing>
           <wp:inline xmlns:a="http://schemas.openxmlformats.org/drawingml/2006/main" xmlns:pic="http://schemas.openxmlformats.org/drawingml/2006/picture">
-            <wp:extent cx="5580000" cy="3579458"/>
+            <wp:extent cx="5580000" cy="3286969"/>
             <wp:docPr id="12" name="Picture 12"/>
             <wp:cNvGraphicFramePr>
               <a:graphicFrameLocks noChangeAspect="1"/>
@@ -3326,7 +3326,7 @@
       <w:r>
         <w:drawing>
           <wp:inline xmlns:a="http://schemas.openxmlformats.org/drawingml/2006/main" xmlns:pic="http://schemas.openxmlformats.org/drawingml/2006/picture">
-            <wp:extent cx="5580000" cy="3625982"/>
+            <wp:extent cx="5580000" cy="3266625"/>
             <wp:docPr id="13" name="Picture 13"/>
             <wp:cNvGraphicFramePr>
               <a:graphicFrameLocks noChangeAspect="1"/>
@@ -3422,7 +3422,7 @@
       <w:r>
         <w:drawing>
           <wp:inline xmlns:a="http://schemas.openxmlformats.org/drawingml/2006/main" xmlns:pic="http://schemas.openxmlformats.org/drawingml/2006/picture">
-            <wp:extent cx="5486400" cy="3287837"/>
+            <wp:extent cx="5486400" cy="3014662"/>
             <wp:docPr id="15" name="Picture 15"/>
             <wp:cNvGraphicFramePr>
               <a:graphicFrameLocks noChangeAspect="1"/>

</xml_diff>

<commit_message>
Dokumentacja: nazwa AdminReminder i odswiezone zrzuty ekranu (#4)
Oba dokumenty zostaly przy starej nazwie — sed przy zmianie nazwy szedl po
plikach tekstowych, a .docx to zip z XML-em, wiec go nie dotknal.

- tekst: 3 wystapienia "Admin Redminer" (1 w Technicznej, 2 w Powdrozeniowej)
- Powdrozeniowa niosla w sobie komplet 15 STARYCH zrzutow ekranu ze starym
  logo — te same pliki, ktore podmienilismy w screenshots/; dopasowanie po
  wymiarach i rozmiarze w bajtach bylo 1:1, wiec kazdy zostal zastapiony
  swoim odpowiednikiem

Cztery zrzuty (pelnostronicowe zakladki ustawien) maja teraz inna wysokosc niz
poprzednio, wiec wp:extent zostal przeliczony proporcjonalnie — bez tego
wyswietlalyby sie rozciagniete o kilka procent.

Zmieniona wylacznie warstwa nazwy i obrazow, tresc merytoryczna nietknieta:
dlugosc tekstu 15833 -> 15831 znakow, czyli dokladnie -2 za dwa skrocone
wystapienia nazwy. XML wszystkich czesci parsuje sie poprawnie.
</commit_message>
<xml_diff>
--- a/docs/AR_Dokumentacja_Powdrozeniowa.docx
+++ b/docs/AR_Dokumentacja_Powdrozeniowa.docx
@@ -28,7 +28,7 @@
           <w:color w:val="606060"/>
           <w:sz w:val="32"/>
         </w:rPr>
-        <w:t>Admin Redminer</w:t>
+        <w:t>AdminReminder</w:t>
       </w:r>
     </w:p>
     <w:p/>
@@ -382,7 +382,7 @@
     </w:p>
     <w:p>
       <w:r>
-        <w:t>Admin Redminer (AR) to narzędzie „od admina dla admina” do śledzenia terminów ważności i odnowień. Zastępuje listę w Excelu/SharePoincie czymś, co samo pobiera daty i ostrzega zawczasu. AR monitoruje dwie klasy obiektów:</w:t>
+        <w:t>AdminReminder (AR) to narzędzie „od admina dla admina” do śledzenia terminów ważności i odnowień. Zastępuje listę w Excelu/SharePoincie czymś, co samo pobiera daty i ostrzega zawczasu. AR monitoruje dwie klasy obiektów:</w:t>
       </w:r>
     </w:p>
     <w:p>
@@ -3182,7 +3182,7 @@
       <w:r>
         <w:drawing>
           <wp:inline xmlns:a="http://schemas.openxmlformats.org/drawingml/2006/main" xmlns:pic="http://schemas.openxmlformats.org/drawingml/2006/picture">
-            <wp:extent cx="5580000" cy="2695498"/>
+            <wp:extent cx="5580000" cy="2644688"/>
             <wp:docPr id="10" name="Picture 10"/>
             <wp:cNvGraphicFramePr>
               <a:graphicFrameLocks noChangeAspect="1"/>
@@ -3278,7 +3278,7 @@
       <w:r>
         <w:drawing>
           <wp:inline xmlns:a="http://schemas.openxmlformats.org/drawingml/2006/main" xmlns:pic="http://schemas.openxmlformats.org/drawingml/2006/picture">
-            <wp:extent cx="5580000" cy="3579458"/>
+            <wp:extent cx="5580000" cy="3286969"/>
             <wp:docPr id="12" name="Picture 12"/>
             <wp:cNvGraphicFramePr>
               <a:graphicFrameLocks noChangeAspect="1"/>
@@ -3326,7 +3326,7 @@
       <w:r>
         <w:drawing>
           <wp:inline xmlns:a="http://schemas.openxmlformats.org/drawingml/2006/main" xmlns:pic="http://schemas.openxmlformats.org/drawingml/2006/picture">
-            <wp:extent cx="5580000" cy="3625982"/>
+            <wp:extent cx="5580000" cy="3266625"/>
             <wp:docPr id="13" name="Picture 13"/>
             <wp:cNvGraphicFramePr>
               <a:graphicFrameLocks noChangeAspect="1"/>
@@ -3422,7 +3422,7 @@
       <w:r>
         <w:drawing>
           <wp:inline xmlns:a="http://schemas.openxmlformats.org/drawingml/2006/main" xmlns:pic="http://schemas.openxmlformats.org/drawingml/2006/picture">
-            <wp:extent cx="5486400" cy="3287837"/>
+            <wp:extent cx="5486400" cy="3014662"/>
             <wp:docPr id="15" name="Picture 15"/>
             <wp:cNvGraphicFramePr>
               <a:graphicFrameLocks noChangeAspect="1"/>

</xml_diff>